<commit_message>
publish student projects (Fall 2026) 2026-09-22 20:49
</commit_message>
<xml_diff>
--- a/Games/dash-party.docx
+++ b/Games/dash-party.docx
@@ -2187,13 +2187,43 @@
         <w:rPr>
           <w:b/>
         </w:rPr>
-        <w:t xml:space="preserve">Recommended composition:</w:t>
-      </w:r>
-      <w:r>
-        <w:t xml:space="preserve"> </w:t>
-      </w:r>
-      <w:r>
-        <w:t xml:space="preserve">6 CS + 2 Design + 1 Art (9) — the design surface is unusually large for a party title (4 distinct game modes each with its own ruleset and courses, 4 controller layouts, the two-players-one-car mechanic, and the skin/currency economy), so two designers split the mode/level/systems design and the UI/UX across the shared-screen HUD and the phone-controller pages; a single artist can carry a cohesive retro-arcade pixel style (3 car types + their skins as palette/variant sets, four modest course/obstacle sets, and the arcade UI) — small, palette-driven sprites keep the volume tractable for one (rules: min 1 Design mandated, max 9 total, D+A ≤ 3; see</w:t>
+        <w:t xml:space="preserve">Team composition (set by instructor):</w:t>
+      </w:r>
+      <w:r>
+        <w:t xml:space="preserve"> </w:t>
+      </w:r>
+      <w:r>
+        <w:t xml:space="preserve">6 CS + 2 Design + 0 Art (8) — the design surface is unusually large for a party title (4 distinct game modes each with its own ruleset and courses, 4 controller layouts, the two-players-one-car mechanic, and the skin/currency economy), which the two designers own across the mode/level/systems design and the UI/UX (shared-screen HUD + phone-controller pages); with</w:t>
+      </w:r>
+      <w:r>
+        <w:t xml:space="preserve"> </w:t>
+      </w:r>
+      <w:r>
+        <w:rPr>
+          <w:b/>
+        </w:rPr>
+        <w:t xml:space="preserve">no artist</w:t>
+      </w:r>
+      <w:r>
+        <w:t xml:space="preserve"> </w:t>
+      </w:r>
+      <w:r>
+        <w:t xml:space="preserve">they also take the</w:t>
+      </w:r>
+      <w:r>
+        <w:t xml:space="preserve"> </w:t>
+      </w:r>
+      <w:r>
+        <w:rPr>
+          <w:b/>
+        </w:rPr>
+        <w:t xml:space="preserve">D11 conditional</w:t>
+      </w:r>
+      <w:r>
+        <w:t xml:space="preserve"> </w:t>
+      </w:r>
+      <w:r>
+        <w:t xml:space="preserve">as a real graded Design goal each milestone (M1 Art Proof of Concept / M2 Art Implementation Quality — the last Design goal each milestone), which consumes one Design+UI slot per milestone (rules: min 1 Design mandated, max 9 total, D+A ≤ 3; see</w:t>
       </w:r>
       <w:r>
         <w:t xml:space="preserve"> </w:t>
@@ -2205,7 +2235,37 @@
         <w:t xml:space="preserve">team-formation.pdf</w:t>
       </w:r>
       <w:r>
-        <w:t xml:space="preserve">). If the four modes' art volume outgrows one artist, trade the stretch scope, not the headcount.</w:t>
+        <w:t xml:space="preserve">).</w:t>
+      </w:r>
+      <w:r>
+        <w:t xml:space="preserve"> </w:t>
+      </w:r>
+      <w:r>
+        <w:rPr>
+          <w:b/>
+        </w:rPr>
+        <w:t xml:space="preserve">Art-risk flag:</w:t>
+      </w:r>
+      <w:r>
+        <w:t xml:space="preserve"> </w:t>
+      </w:r>
+      <w:r>
+        <w:t xml:space="preserve">the target look is a</w:t>
+      </w:r>
+      <w:r>
+        <w:t xml:space="preserve"> </w:t>
+      </w:r>
+      <w:r>
+        <w:rPr>
+          <w:b/>
+        </w:rPr>
+        <w:t xml:space="preserve">cohesive retro-arcade pixel style</w:t>
+      </w:r>
+      <w:r>
+        <w:t xml:space="preserve"> </w:t>
+      </w:r>
+      <w:r>
+        <w:t xml:space="preserve">(3 car types + palette/variant skins, four modest course/obstacle sets, the arcade UI) — small, palette-driven sprites keep the volume tractable, so 0 artists is comparatively workable here, but it is still a real surface; scope skins/courses hard under D11 and consider an artist within the D+A ≤ 3 cap if the volume grows.</w:t>
       </w:r>
       <w:r>
         <w:t xml:space="preserve"> </w:t>
@@ -2318,6 +2378,18 @@
     <w:p>
       <w:pPr>
         <w:numPr>
+          <w:ilvl w:val="1"/>
+          <w:numId w:val="1018"/>
+        </w:numPr>
+        <w:pStyle w:val="Compact"/>
+      </w:pPr>
+      <w:r>
+        <w:t xml:space="preserve">M1D11 Art Proof of Concept *(conditional — no artist; Design-owned)* — the retro-arcade visual direction: the 3 car types + skin/variant sets, the four course/obstacle sets and the shared-screen + phone-controller arcade UI; 2 mockups.</w:t>
+      </w:r>
+    </w:p>
+    <w:p>
+      <w:pPr>
+        <w:numPr>
           <w:ilvl w:val="0"/>
           <w:numId w:val="1017"/>
         </w:numPr>
@@ -2393,6 +2465,18 @@
     <w:p>
       <w:pPr>
         <w:numPr>
+          <w:ilvl w:val="1"/>
+          <w:numId w:val="1019"/>
+        </w:numPr>
+        <w:pStyle w:val="Compact"/>
+      </w:pPr>
+      <w:r>
+        <w:t xml:space="preserve">M2D11 Art Implementation Quality *(conditional — no artist; Design-owned)* — the cars/skins, course/obstacle sets and arcade UI implemented in-engine, no placeholders.</w:t>
+      </w:r>
+    </w:p>
+    <w:p>
+      <w:pPr>
+        <w:numPr>
           <w:ilvl w:val="0"/>
           <w:numId w:val="1017"/>
         </w:numPr>
@@ -2438,18 +2522,6 @@
     <w:p>
       <w:pPr>
         <w:numPr>
-          <w:ilvl w:val="1"/>
-          <w:numId w:val="1020"/>
-        </w:numPr>
-        <w:pStyle w:val="Compact"/>
-      </w:pPr>
-      <w:r>
-        <w:t xml:space="preserve">M1U5 Mobile UX Adaptation &amp; Ergonomics — the gyroscope controller designed for thumbs and quick party sessions on the reference device.</w:t>
-      </w:r>
-    </w:p>
-    <w:p>
-      <w:pPr>
-        <w:numPr>
           <w:ilvl w:val="0"/>
           <w:numId w:val="1017"/>
         </w:numPr>
@@ -2489,18 +2561,6 @@
     <w:p>
       <w:pPr>
         <w:numPr>
-          <w:ilvl w:val="1"/>
-          <w:numId w:val="1021"/>
-        </w:numPr>
-        <w:pStyle w:val="Compact"/>
-      </w:pPr>
-      <w:r>
-        <w:t xml:space="preserve">M2U3 Menu &amp; HUD Motion Design — countdown, position/lap changes and the podium/results sequence animated in the arcade style.</w:t>
-      </w:r>
-    </w:p>
-    <w:p>
-      <w:pPr>
-        <w:numPr>
           <w:ilvl w:val="0"/>
           <w:numId w:val="1017"/>
         </w:numPr>
@@ -2510,49 +2570,13 @@
         <w:rPr>
           <w:b/>
         </w:rPr>
-        <w:t xml:space="preserve">Art M1:</w:t>
-      </w:r>
-      <w:r>
-        <w:t xml:space="preserve"> </w:t>
-      </w:r>
-      <w:r>
-        <w:t xml:space="preserve">1 artist (cohesive retro pixel style keeps volume tractable)</w:t>
-      </w:r>
-    </w:p>
-    <w:p>
-      <w:pPr>
-        <w:numPr>
-          <w:ilvl w:val="1"/>
-          <w:numId w:val="1022"/>
-        </w:numPr>
-        <w:pStyle w:val="Compact"/>
-      </w:pPr>
-      <w:r>
-        <w:t xml:space="preserve">M1A1 ⭐ Art Bible / Proof of Concept (the retro-arcade visual direction — palette, pixel scale, the party-racer tone)</w:t>
-      </w:r>
-    </w:p>
-    <w:p>
-      <w:pPr>
-        <w:numPr>
-          <w:ilvl w:val="1"/>
-          <w:numId w:val="1022"/>
-        </w:numPr>
-        <w:pStyle w:val="Compact"/>
-      </w:pPr>
-      <w:r>
-        <w:t xml:space="preserve">M1A2 Character Concepts &amp; Model Sheets (the 3 car types as the "cast" + the 3-skins-each variant sheets)</w:t>
-      </w:r>
-    </w:p>
-    <w:p>
-      <w:pPr>
-        <w:numPr>
-          <w:ilvl w:val="1"/>
-          <w:numId w:val="1022"/>
-        </w:numPr>
-        <w:pStyle w:val="Compact"/>
-      </w:pPr>
-      <w:r>
-        <w:t xml:space="preserve">M1A3 Environment, Props &amp; VFX Concepts (the four modes' courses, obstacles and props)</w:t>
+        <w:t xml:space="preserve">Art:</w:t>
+      </w:r>
+      <w:r>
+        <w:t xml:space="preserve"> </w:t>
+      </w:r>
+      <w:r>
+        <w:t xml:space="preserve">0 artists — the art surface (the 3 car types + palette/variant skins, the four course/obstacle sets and the shared-screen + phone-controller arcade UI) is covered by the D11 conditionals, taken as Design goals by the two designers (see Design M1/M2). The cohesive retro-arcade pixel style keeps the volume tractable, so 0 artists is comparatively workable — but scope skins/courses hard and lean on a palette-driven style.</w:t>
       </w:r>
     </w:p>
     <w:p>
@@ -2567,43 +2591,31 @@
         <w:rPr>
           <w:b/>
         </w:rPr>
-        <w:t xml:space="preserve">Art M2:</w:t>
-      </w:r>
-    </w:p>
-    <w:p>
-      <w:pPr>
-        <w:numPr>
-          <w:ilvl w:val="1"/>
-          <w:numId w:val="1023"/>
-        </w:numPr>
-        <w:pStyle w:val="Compact"/>
-      </w:pPr>
-      <w:r>
-        <w:t xml:space="preserve">M2A1 ⭐ Critical Asset Production &amp; In-Engine Visual Quality (cars, skins, courses and HUD implemented and consistent in the showcase build)</w:t>
-      </w:r>
-    </w:p>
-    <w:p>
-      <w:pPr>
-        <w:numPr>
-          <w:ilvl w:val="1"/>
-          <w:numId w:val="1023"/>
-        </w:numPr>
-        <w:pStyle w:val="Compact"/>
-      </w:pPr>
-      <w:r>
-        <w:t xml:space="preserve">M2A3 Environment Alive — Ambient Animation &amp; Layering (animated crowds, hazards and parallax that make the tracks read as arcade)</w:t>
-      </w:r>
-    </w:p>
-    <w:p>
-      <w:pPr>
-        <w:numPr>
-          <w:ilvl w:val="1"/>
-          <w:numId w:val="1023"/>
-        </w:numPr>
-        <w:pStyle w:val="Compact"/>
-      </w:pPr>
-      <w:r>
-        <w:t xml:space="preserve">M2A5 VFX — Critical Effects &amp; Transitions (drift smoke, boost, crashes, pickups and the mode/podium transitions — the arcade juice)</w:t>
+        <w:t xml:space="preserve">TEAM M1:</w:t>
+      </w:r>
+    </w:p>
+    <w:p>
+      <w:pPr>
+        <w:numPr>
+          <w:ilvl w:val="1"/>
+          <w:numId w:val="1022"/>
+        </w:numPr>
+        <w:pStyle w:val="Compact"/>
+      </w:pPr>
+      <w:r>
+        <w:t xml:space="preserve">M1TA1 ⭐ Overall Audio Experience — initial BGM/SFX from the week-5 needs list present &amp; working in the prototype (upbeat chiptune BGM, engine/drift/boost/crash/pickup cues), suitable and correctly triggered.</w:t>
+      </w:r>
+    </w:p>
+    <w:p>
+      <w:pPr>
+        <w:numPr>
+          <w:ilvl w:val="1"/>
+          <w:numId w:val="1022"/>
+        </w:numPr>
+        <w:pStyle w:val="Compact"/>
+      </w:pPr>
+      <w:r>
+        <w:t xml:space="preserve">M1TA2 ⭐ Audio Engine Functionality — data-driven audio pipeline (add/replace files without recompiling) + reliable multi-channel playback for overlapping race SFX.</w:t>
       </w:r>
     </w:p>
     <w:p>
@@ -2618,45 +2630,6 @@
         <w:rPr>
           <w:b/>
         </w:rPr>
-        <w:t xml:space="preserve">TEAM M1:</w:t>
-      </w:r>
-    </w:p>
-    <w:p>
-      <w:pPr>
-        <w:numPr>
-          <w:ilvl w:val="1"/>
-          <w:numId w:val="1024"/>
-        </w:numPr>
-        <w:pStyle w:val="Compact"/>
-      </w:pPr>
-      <w:r>
-        <w:t xml:space="preserve">M1TA1 ⭐ Overall Audio Experience — initial BGM/SFX from the week-5 needs list present &amp; working in the prototype (upbeat chiptune BGM, engine/drift/boost/crash/pickup cues), suitable and correctly triggered.</w:t>
-      </w:r>
-    </w:p>
-    <w:p>
-      <w:pPr>
-        <w:numPr>
-          <w:ilvl w:val="1"/>
-          <w:numId w:val="1024"/>
-        </w:numPr>
-        <w:pStyle w:val="Compact"/>
-      </w:pPr>
-      <w:r>
-        <w:t xml:space="preserve">M1TA2 ⭐ Audio Engine Functionality — data-driven audio pipeline (add/replace files without recompiling) + reliable multi-channel playback for overlapping race SFX.</w:t>
-      </w:r>
-    </w:p>
-    <w:p>
-      <w:pPr>
-        <w:numPr>
-          <w:ilvl w:val="0"/>
-          <w:numId w:val="1017"/>
-        </w:numPr>
-        <w:pStyle w:val="Compact"/>
-      </w:pPr>
-      <w:r>
-        <w:rPr>
-          <w:b/>
-        </w:rPr>
         <w:t xml:space="preserve">TEAM M2:</w:t>
       </w:r>
     </w:p>
@@ -2664,7 +2637,7 @@
       <w:pPr>
         <w:numPr>
           <w:ilvl w:val="1"/>
-          <w:numId w:val="1025"/>
+          <w:numId w:val="1023"/>
         </w:numPr>
         <w:pStyle w:val="Compact"/>
       </w:pPr>
@@ -2676,7 +2649,7 @@
       <w:pPr>
         <w:numPr>
           <w:ilvl w:val="1"/>
-          <w:numId w:val="1025"/>
+          <w:numId w:val="1023"/>
         </w:numPr>
         <w:pStyle w:val="Compact"/>
       </w:pPr>
@@ -2688,7 +2661,7 @@
       <w:pPr>
         <w:numPr>
           <w:ilvl w:val="1"/>
-          <w:numId w:val="1025"/>
+          <w:numId w:val="1023"/>
         </w:numPr>
         <w:pStyle w:val="Compact"/>
       </w:pPr>
@@ -3033,12 +3006,6 @@
     <w:abstractNumId w:val="991"/>
   </w:num>
   <w:num w:numId="1023">
-    <w:abstractNumId w:val="991"/>
-  </w:num>
-  <w:num w:numId="1024">
-    <w:abstractNumId w:val="991"/>
-  </w:num>
-  <w:num w:numId="1025">
     <w:abstractNumId w:val="991"/>
   </w:num>
 </w:numbering>

</xml_diff>